<commit_message>
hoan thien ngan han
</commit_message>
<xml_diff>
--- a/src/main/resources/templates/BaoCaoThamDinhVaDeXuatChoVay.docx
+++ b/src/main/resources/templates/BaoCaoThamDinhVaDeXuatChoVay.docx
@@ -254,310 +254,317 @@
         </w:rPr>
         <w:t>{{canBoTDVT}}</w:t>
       </w:r>
+      <w:r>
+        <w:rPr>
+          <w:rFonts w:ascii="Times New Roman" w:hAnsi="Times New Roman"/>
+          <w:sz w:val="26"/>
+        </w:rPr>
+        <w:t xml:space="preserve"> </w:t>
+      </w:r>
+      <w:r>
+        <w:rPr>
+          <w:rFonts w:ascii="Times New Roman" w:hAnsi="Times New Roman"/>
+          <w:sz w:val="26"/>
+        </w:rPr>
+        <w:t>– Chức vụ: Cán bộ</w:t>
+      </w:r>
+      <w:r>
+        <w:rPr>
+          <w:rFonts w:ascii="Times New Roman" w:hAnsi="Times New Roman"/>
+          <w:sz w:val="26"/>
+        </w:rPr>
+        <w:t xml:space="preserve"> thẩm định</w:t>
+      </w:r>
+      <w:r>
+        <w:rPr>
+          <w:rFonts w:ascii="Times New Roman" w:hAnsi="Times New Roman"/>
+          <w:sz w:val="26"/>
+        </w:rPr>
+        <w:t xml:space="preserve"> đã tiến hành thẩm định các điều kiện vay vốn và lập báo cáo thẩm định và đề xuất cho vay như sau:</w:t>
+      </w:r>
+    </w:p>
+    <w:p>
+      <w:pPr>
+        <w:rPr>
+          <w:rFonts w:ascii="Times New Roman" w:hAnsi="Times New Roman"/>
+          <w:b/>
+          <w:sz w:val="26"/>
+        </w:rPr>
+      </w:pPr>
+      <w:r>
+        <w:rPr>
+          <w:rFonts w:ascii="Times New Roman" w:hAnsi="Times New Roman"/>
+          <w:b/>
+          <w:sz w:val="26"/>
+        </w:rPr>
+        <w:t>I. NỘI DUNG ĐÁNH GIÁ VỀ KHÁCH HÀNG</w:t>
+      </w:r>
+    </w:p>
+    <w:p>
+      <w:pPr>
+        <w:rPr>
+          <w:rFonts w:ascii="Times New Roman" w:hAnsi="Times New Roman"/>
+          <w:b/>
+          <w:sz w:val="26"/>
+        </w:rPr>
+      </w:pPr>
+      <w:r>
+        <w:rPr>
+          <w:rFonts w:ascii="Times New Roman" w:hAnsi="Times New Roman"/>
+          <w:b/>
+          <w:sz w:val="26"/>
+        </w:rPr>
+        <w:t>1. Thông tin chung về khách hàng:</w:t>
+      </w:r>
+    </w:p>
+    <w:p>
+      <w:pPr>
+        <w:rPr>
+          <w:rFonts w:ascii="Times New Roman" w:hAnsi="Times New Roman"/>
+          <w:sz w:val="26"/>
+        </w:rPr>
+      </w:pPr>
+      <w:r>
+        <w:rPr>
+          <w:rFonts w:ascii="Times New Roman" w:hAnsi="Times New Roman"/>
+          <w:sz w:val="26"/>
+        </w:rPr>
+        <w:t>Tên người vay vố</w:t>
+      </w:r>
+      <w:r>
+        <w:rPr>
+          <w:rFonts w:ascii="Times New Roman" w:hAnsi="Times New Roman"/>
+          <w:sz w:val="26"/>
+        </w:rPr>
+        <w:t xml:space="preserve">n:         </w:t>
+      </w:r>
+      <w:r>
+        <w:rPr>
+          <w:rFonts w:ascii="Times New Roman" w:hAnsi="Times New Roman"/>
+          <w:b/>
+          <w:sz w:val="26"/>
+        </w:rPr>
+        <w:t>{{kh}}</w:t>
+      </w:r>
+      <w:r>
+        <w:rPr>
+          <w:rFonts w:ascii="Times New Roman" w:hAnsi="Times New Roman"/>
+          <w:sz w:val="26"/>
+        </w:rPr>
+        <w:t xml:space="preserve">                   </w:t>
+      </w:r>
+      <w:r>
+        <w:rPr>
+          <w:rFonts w:ascii="Times New Roman" w:hAnsi="Times New Roman"/>
+          <w:sz w:val="26"/>
+        </w:rPr>
+        <w:t xml:space="preserve">       </w:t>
+      </w:r>
+      <w:r>
+        <w:rPr>
+          <w:rFonts w:ascii="Times New Roman" w:hAnsi="Times New Roman"/>
+          <w:sz w:val="26"/>
+        </w:rPr>
+        <w:t>Sinh ngày</w:t>
+      </w:r>
+      <w:r>
+        <w:rPr>
+          <w:rFonts w:ascii="Times New Roman" w:hAnsi="Times New Roman"/>
+          <w:sz w:val="26"/>
+        </w:rPr>
+        <w:t>: {{nskh}}</w:t>
+      </w:r>
+    </w:p>
+    <w:p>
+      <w:pPr>
+        <w:rPr>
+          <w:rFonts w:ascii="Times New Roman" w:hAnsi="Times New Roman"/>
+          <w:sz w:val="26"/>
+        </w:rPr>
+      </w:pPr>
+      <w:r>
+        <w:rPr>
+          <w:rFonts w:ascii="Times New Roman" w:hAnsi="Times New Roman"/>
+          <w:sz w:val="26"/>
+        </w:rPr>
+        <w:t xml:space="preserve">CC/CCCD Số: {{cccdkh}}                </w:t>
+      </w:r>
+      <w:r>
+        <w:rPr>
+          <w:rFonts w:ascii="Times New Roman" w:hAnsi="Times New Roman"/>
+          <w:sz w:val="26"/>
+        </w:rPr>
+        <w:tab/>
+      </w:r>
+      <w:r>
+        <w:rPr>
+          <w:rFonts w:ascii="Times New Roman" w:hAnsi="Times New Roman"/>
+          <w:sz w:val="26"/>
+        </w:rPr>
+        <w:tab/>
+      </w:r>
+      <w:r>
+        <w:rPr>
+          <w:rFonts w:ascii="Times New Roman" w:hAnsi="Times New Roman"/>
+          <w:sz w:val="26"/>
+        </w:rPr>
+        <w:tab/>
+        <w:t xml:space="preserve">      </w:t>
+      </w:r>
+      <w:r>
+        <w:rPr>
+          <w:rFonts w:ascii="Times New Roman" w:hAnsi="Times New Roman"/>
+          <w:sz w:val="26"/>
+        </w:rPr>
+        <w:t xml:space="preserve">  </w:t>
+      </w:r>
+      <w:r>
+        <w:rPr>
+          <w:rFonts w:ascii="Times New Roman" w:hAnsi="Times New Roman"/>
+          <w:sz w:val="26"/>
+        </w:rPr>
+        <w:t xml:space="preserve">       </w:t>
+      </w:r>
+      <w:r>
+        <w:rPr>
+          <w:rFonts w:ascii="Times New Roman" w:hAnsi="Times New Roman"/>
+          <w:sz w:val="26"/>
+        </w:rPr>
+        <w:t xml:space="preserve">Ngày cấp: {{nckh}};      </w:t>
+      </w:r>
+    </w:p>
+    <w:p>
+      <w:pPr>
+        <w:rPr>
+          <w:rFonts w:ascii="Times New Roman" w:hAnsi="Times New Roman"/>
+          <w:sz w:val="26"/>
+        </w:rPr>
+      </w:pPr>
+      <w:r>
+        <w:rPr>
+          <w:rFonts w:ascii="Times New Roman" w:hAnsi="Times New Roman"/>
+          <w:sz w:val="26"/>
+        </w:rPr>
+        <w:t>Nơi cấp: {{nccccdkh}}</w:t>
+      </w:r>
+    </w:p>
+    <w:p>
+      <w:pPr>
+        <w:rPr>
+          <w:rFonts w:ascii="Times New Roman" w:hAnsi="Times New Roman"/>
+          <w:sz w:val="26"/>
+        </w:rPr>
+      </w:pPr>
+      <w:r>
+        <w:rPr>
+          <w:rFonts w:ascii="Times New Roman" w:hAnsi="Times New Roman"/>
+          <w:sz w:val="26"/>
+        </w:rPr>
+        <w:t>Và Ông/bà</w:t>
+      </w:r>
+      <w:r>
+        <w:rPr>
+          <w:rFonts w:ascii="Times New Roman" w:hAnsi="Times New Roman"/>
+          <w:sz w:val="26"/>
+        </w:rPr>
+        <w:t xml:space="preserve">:  </w:t>
+      </w:r>
+      <w:r>
+        <w:rPr>
+          <w:rFonts w:ascii="Times New Roman" w:hAnsi="Times New Roman"/>
+          <w:sz w:val="26"/>
+        </w:rPr>
+        <w:t xml:space="preserve">                    </w:t>
+      </w:r>
+      <w:r>
+        <w:rPr>
+          <w:rFonts w:ascii="Times New Roman" w:hAnsi="Times New Roman"/>
+          <w:b/>
+          <w:sz w:val="26"/>
+        </w:rPr>
+        <w:t>{{ntkh}}</w:t>
+      </w:r>
+      <w:r>
+        <w:rPr>
+          <w:rFonts w:ascii="Times New Roman" w:hAnsi="Times New Roman"/>
+          <w:sz w:val="26"/>
+        </w:rPr>
+        <w:t xml:space="preserve">                   </w:t>
+      </w:r>
+      <w:r>
+        <w:rPr>
+          <w:rFonts w:ascii="Times New Roman" w:hAnsi="Times New Roman"/>
+          <w:sz w:val="26"/>
+        </w:rPr>
+        <w:t xml:space="preserve">          </w:t>
+      </w:r>
+      <w:r>
+        <w:rPr>
+          <w:rFonts w:ascii="Times New Roman" w:hAnsi="Times New Roman"/>
+          <w:sz w:val="26"/>
+        </w:rPr>
+        <w:t>Sinh ngày</w:t>
+      </w:r>
+      <w:r>
+        <w:rPr>
+          <w:rFonts w:ascii="Times New Roman" w:hAnsi="Times New Roman"/>
+          <w:sz w:val="26"/>
+        </w:rPr>
+        <w:t xml:space="preserve">: {{nsnt}}   </w:t>
+      </w:r>
+    </w:p>
+    <w:p>
+      <w:pPr>
+        <w:rPr>
+          <w:rFonts w:ascii="Times New Roman" w:hAnsi="Times New Roman"/>
+          <w:sz w:val="26"/>
+        </w:rPr>
+      </w:pPr>
+      <w:r>
+        <w:rPr>
+          <w:rFonts w:ascii="Times New Roman" w:hAnsi="Times New Roman"/>
+          <w:sz w:val="26"/>
+        </w:rPr>
+        <w:t xml:space="preserve">CC/CCCD Số: {{cccdnt}}                </w:t>
+      </w:r>
+      <w:r>
+        <w:rPr>
+          <w:rFonts w:ascii="Times New Roman" w:hAnsi="Times New Roman"/>
+          <w:sz w:val="26"/>
+        </w:rPr>
+        <w:tab/>
+      </w:r>
+      <w:r>
+        <w:rPr>
+          <w:rFonts w:ascii="Times New Roman" w:hAnsi="Times New Roman"/>
+          <w:sz w:val="26"/>
+        </w:rPr>
+        <w:tab/>
+      </w:r>
+      <w:r>
+        <w:rPr>
+          <w:rFonts w:ascii="Times New Roman" w:hAnsi="Times New Roman"/>
+          <w:sz w:val="26"/>
+        </w:rPr>
+        <w:tab/>
+        <w:t xml:space="preserve">      </w:t>
+      </w:r>
+      <w:r>
+        <w:rPr>
+          <w:rFonts w:ascii="Times New Roman" w:hAnsi="Times New Roman"/>
+          <w:sz w:val="26"/>
+        </w:rPr>
+        <w:t xml:space="preserve"> </w:t>
+      </w:r>
+      <w:r>
+        <w:rPr>
+          <w:rFonts w:ascii="Times New Roman" w:hAnsi="Times New Roman"/>
+          <w:sz w:val="26"/>
+        </w:rPr>
+        <w:t xml:space="preserve">            </w:t>
+      </w:r>
       <w:bookmarkStart w:id="0" w:name="_GoBack"/>
       <w:bookmarkEnd w:id="0"/>
-      <w:r>
-        <w:rPr>
-          <w:rFonts w:ascii="Times New Roman" w:hAnsi="Times New Roman"/>
-          <w:sz w:val="26"/>
-        </w:rPr>
-        <w:t xml:space="preserve"> </w:t>
-      </w:r>
-      <w:r>
-        <w:rPr>
-          <w:rFonts w:ascii="Times New Roman" w:hAnsi="Times New Roman"/>
-          <w:sz w:val="26"/>
-        </w:rPr>
-        <w:t>– Chức vụ: Cán bộ</w:t>
-      </w:r>
-      <w:r>
-        <w:rPr>
-          <w:rFonts w:ascii="Times New Roman" w:hAnsi="Times New Roman"/>
-          <w:sz w:val="26"/>
-        </w:rPr>
-        <w:t xml:space="preserve"> thẩm định</w:t>
-      </w:r>
-      <w:r>
-        <w:rPr>
-          <w:rFonts w:ascii="Times New Roman" w:hAnsi="Times New Roman"/>
-          <w:sz w:val="26"/>
-        </w:rPr>
-        <w:t xml:space="preserve"> đã tiến hành thẩm định các điều kiện vay vốn và lập báo cáo thẩm định và đề xuất cho vay như sau:</w:t>
-      </w:r>
-    </w:p>
-    <w:p>
-      <w:pPr>
-        <w:rPr>
-          <w:rFonts w:ascii="Times New Roman" w:hAnsi="Times New Roman"/>
-          <w:b/>
-          <w:sz w:val="26"/>
-        </w:rPr>
-      </w:pPr>
-      <w:r>
-        <w:rPr>
-          <w:rFonts w:ascii="Times New Roman" w:hAnsi="Times New Roman"/>
-          <w:b/>
-          <w:sz w:val="26"/>
-        </w:rPr>
-        <w:t>I. NỘI DUNG ĐÁNH GIÁ VỀ KHÁCH HÀNG</w:t>
-      </w:r>
-    </w:p>
-    <w:p>
-      <w:pPr>
-        <w:rPr>
-          <w:rFonts w:ascii="Times New Roman" w:hAnsi="Times New Roman"/>
-          <w:b/>
-          <w:sz w:val="26"/>
-        </w:rPr>
-      </w:pPr>
-      <w:r>
-        <w:rPr>
-          <w:rFonts w:ascii="Times New Roman" w:hAnsi="Times New Roman"/>
-          <w:b/>
-          <w:sz w:val="26"/>
-        </w:rPr>
-        <w:t>1. Thông tin chung về khách hàng:</w:t>
-      </w:r>
-    </w:p>
-    <w:p>
-      <w:pPr>
-        <w:rPr>
-          <w:rFonts w:ascii="Times New Roman" w:hAnsi="Times New Roman"/>
-          <w:sz w:val="26"/>
-        </w:rPr>
-      </w:pPr>
-      <w:r>
-        <w:rPr>
-          <w:rFonts w:ascii="Times New Roman" w:hAnsi="Times New Roman"/>
-          <w:sz w:val="26"/>
-        </w:rPr>
-        <w:t>Tên người vay vố</w:t>
-      </w:r>
-      <w:r>
-        <w:rPr>
-          <w:rFonts w:ascii="Times New Roman" w:hAnsi="Times New Roman"/>
-          <w:sz w:val="26"/>
-        </w:rPr>
-        <w:t xml:space="preserve">n:         </w:t>
-      </w:r>
-      <w:r>
-        <w:rPr>
-          <w:rFonts w:ascii="Times New Roman" w:hAnsi="Times New Roman"/>
-          <w:b/>
-          <w:sz w:val="26"/>
-        </w:rPr>
-        <w:t>{{kh}}</w:t>
-      </w:r>
-      <w:r>
-        <w:rPr>
-          <w:rFonts w:ascii="Times New Roman" w:hAnsi="Times New Roman"/>
-          <w:sz w:val="26"/>
-        </w:rPr>
-        <w:t xml:space="preserve">                   </w:t>
-      </w:r>
-      <w:r>
-        <w:rPr>
-          <w:rFonts w:ascii="Times New Roman" w:hAnsi="Times New Roman"/>
-          <w:sz w:val="26"/>
-        </w:rPr>
-        <w:t xml:space="preserve">       </w:t>
-      </w:r>
-      <w:r>
-        <w:rPr>
-          <w:rFonts w:ascii="Times New Roman" w:hAnsi="Times New Roman"/>
-          <w:sz w:val="26"/>
-        </w:rPr>
-        <w:t>Sinh ngày</w:t>
-      </w:r>
-      <w:r>
-        <w:rPr>
-          <w:rFonts w:ascii="Times New Roman" w:hAnsi="Times New Roman"/>
-          <w:sz w:val="26"/>
-        </w:rPr>
-        <w:t>: {{nskh}}</w:t>
-      </w:r>
-    </w:p>
-    <w:p>
-      <w:pPr>
-        <w:rPr>
-          <w:rFonts w:ascii="Times New Roman" w:hAnsi="Times New Roman"/>
-          <w:sz w:val="26"/>
-        </w:rPr>
-      </w:pPr>
-      <w:r>
-        <w:rPr>
-          <w:rFonts w:ascii="Times New Roman" w:hAnsi="Times New Roman"/>
-          <w:sz w:val="26"/>
-        </w:rPr>
-        <w:t xml:space="preserve">CC/CCCD Số: {{cccdkh}}                </w:t>
-      </w:r>
-      <w:r>
-        <w:rPr>
-          <w:rFonts w:ascii="Times New Roman" w:hAnsi="Times New Roman"/>
-          <w:sz w:val="26"/>
-        </w:rPr>
-        <w:tab/>
-      </w:r>
-      <w:r>
-        <w:rPr>
-          <w:rFonts w:ascii="Times New Roman" w:hAnsi="Times New Roman"/>
-          <w:sz w:val="26"/>
-        </w:rPr>
-        <w:tab/>
-      </w:r>
-      <w:r>
-        <w:rPr>
-          <w:rFonts w:ascii="Times New Roman" w:hAnsi="Times New Roman"/>
-          <w:sz w:val="26"/>
-        </w:rPr>
-        <w:tab/>
-        <w:t xml:space="preserve">      </w:t>
-      </w:r>
-      <w:r>
-        <w:rPr>
-          <w:rFonts w:ascii="Times New Roman" w:hAnsi="Times New Roman"/>
-          <w:sz w:val="26"/>
-        </w:rPr>
-        <w:t xml:space="preserve">  </w:t>
-      </w:r>
-      <w:r>
-        <w:rPr>
-          <w:rFonts w:ascii="Times New Roman" w:hAnsi="Times New Roman"/>
-          <w:sz w:val="26"/>
-        </w:rPr>
-        <w:t xml:space="preserve">       </w:t>
-      </w:r>
-      <w:r>
-        <w:rPr>
-          <w:rFonts w:ascii="Times New Roman" w:hAnsi="Times New Roman"/>
-          <w:sz w:val="26"/>
-        </w:rPr>
-        <w:t xml:space="preserve">Ngày cấp: {{nckh}};      </w:t>
-      </w:r>
-    </w:p>
-    <w:p>
-      <w:pPr>
-        <w:rPr>
-          <w:rFonts w:ascii="Times New Roman" w:hAnsi="Times New Roman"/>
-          <w:sz w:val="26"/>
-        </w:rPr>
-      </w:pPr>
-      <w:r>
-        <w:rPr>
-          <w:rFonts w:ascii="Times New Roman" w:hAnsi="Times New Roman"/>
-          <w:sz w:val="26"/>
-        </w:rPr>
-        <w:t>Nơi cấp: {{nccccdkh}}</w:t>
-      </w:r>
-    </w:p>
-    <w:p>
-      <w:pPr>
-        <w:rPr>
-          <w:rFonts w:ascii="Times New Roman" w:hAnsi="Times New Roman"/>
-          <w:sz w:val="26"/>
-        </w:rPr>
-      </w:pPr>
-      <w:r>
-        <w:rPr>
-          <w:rFonts w:ascii="Times New Roman" w:hAnsi="Times New Roman"/>
-          <w:sz w:val="26"/>
-        </w:rPr>
-        <w:t>Và Ông/bà</w:t>
-      </w:r>
-      <w:r>
-        <w:rPr>
-          <w:rFonts w:ascii="Times New Roman" w:hAnsi="Times New Roman"/>
-          <w:sz w:val="26"/>
-        </w:rPr>
-        <w:t xml:space="preserve">:  </w:t>
-      </w:r>
-      <w:r>
-        <w:rPr>
-          <w:rFonts w:ascii="Times New Roman" w:hAnsi="Times New Roman"/>
-          <w:sz w:val="26"/>
-        </w:rPr>
-        <w:t xml:space="preserve">                    </w:t>
-      </w:r>
-      <w:r>
-        <w:rPr>
-          <w:rFonts w:ascii="Times New Roman" w:hAnsi="Times New Roman"/>
-          <w:b/>
-          <w:sz w:val="26"/>
-        </w:rPr>
-        <w:t>{{ntkh}}</w:t>
-      </w:r>
-      <w:r>
-        <w:rPr>
-          <w:rFonts w:ascii="Times New Roman" w:hAnsi="Times New Roman"/>
-          <w:sz w:val="26"/>
-        </w:rPr>
-        <w:t xml:space="preserve">                   </w:t>
-      </w:r>
-      <w:r>
-        <w:rPr>
-          <w:rFonts w:ascii="Times New Roman" w:hAnsi="Times New Roman"/>
-          <w:sz w:val="26"/>
-        </w:rPr>
-        <w:t xml:space="preserve">          </w:t>
-      </w:r>
-      <w:r>
-        <w:rPr>
-          <w:rFonts w:ascii="Times New Roman" w:hAnsi="Times New Roman"/>
-          <w:sz w:val="26"/>
-        </w:rPr>
-        <w:t>Sinh ngày</w:t>
-      </w:r>
-      <w:r>
-        <w:rPr>
-          <w:rFonts w:ascii="Times New Roman" w:hAnsi="Times New Roman"/>
-          <w:sz w:val="26"/>
-        </w:rPr>
-        <w:t xml:space="preserve">: {{nsnt}}   </w:t>
-      </w:r>
-    </w:p>
-    <w:p>
-      <w:pPr>
-        <w:rPr>
-          <w:rFonts w:ascii="Times New Roman" w:hAnsi="Times New Roman"/>
-          <w:sz w:val="26"/>
-        </w:rPr>
-      </w:pPr>
-      <w:r>
-        <w:rPr>
-          <w:rFonts w:ascii="Times New Roman" w:hAnsi="Times New Roman"/>
-          <w:sz w:val="26"/>
-        </w:rPr>
-        <w:t xml:space="preserve">CC/CCCD Số: {{cccdnt}}                </w:t>
-      </w:r>
-      <w:r>
-        <w:rPr>
-          <w:rFonts w:ascii="Times New Roman" w:hAnsi="Times New Roman"/>
-          <w:sz w:val="26"/>
-        </w:rPr>
-        <w:tab/>
-      </w:r>
-      <w:r>
-        <w:rPr>
-          <w:rFonts w:ascii="Times New Roman" w:hAnsi="Times New Roman"/>
-          <w:sz w:val="26"/>
-        </w:rPr>
-        <w:tab/>
-      </w:r>
-      <w:r>
-        <w:rPr>
-          <w:rFonts w:ascii="Times New Roman" w:hAnsi="Times New Roman"/>
-          <w:sz w:val="26"/>
-        </w:rPr>
-        <w:tab/>
-        <w:t xml:space="preserve">      </w:t>
-      </w:r>
-      <w:r>
-        <w:rPr>
-          <w:rFonts w:ascii="Times New Roman" w:hAnsi="Times New Roman"/>
-          <w:sz w:val="26"/>
-        </w:rPr>
-        <w:t xml:space="preserve"> </w:t>
-      </w:r>
       <w:r>
         <w:rPr>
           <w:rFonts w:ascii="Times New Roman" w:hAnsi="Times New Roman"/>

</xml_diff>